<commit_message>
Ajuste CFA - repositorio
</commit_message>
<xml_diff>
--- a/fuentes/93610218_CF1_DU.docx
+++ b/fuentes/93610218_CF1_DU.docx
@@ -2694,7 +2694,19 @@
         <w:rPr>
           <w:lang w:val="es-419" w:eastAsia="es-CO"/>
         </w:rPr>
-        <w:t xml:space="preserve"> Representa entre el 80 % y el 95 % del peso total de la fruta. Su proporción puede variar debido a los procesos de respiración y transpiración. El agua ligada se localiza dentro de las células, mientras que el agua no ligada se encuentra entre ellas.</w:t>
+        <w:t xml:space="preserve"> Representa entre el 80</w:t>
+      </w:r>
+      <w:r>
+        <w:rPr>
+          <w:lang w:val="es-419" w:eastAsia="es-CO"/>
+        </w:rPr>
+        <w:t xml:space="preserve"> </w:t>
+      </w:r>
+      <w:r>
+        <w:rPr>
+          <w:lang w:val="es-419" w:eastAsia="es-CO"/>
+        </w:rPr>
+        <w:t>% y el 95 % del peso total de la fruta. Su proporción puede variar debido a los procesos de respiración y transpiración. El agua ligada se localiza dentro de las células, mientras que el agua no ligada se encuentra entre ellas.</w:t>
       </w:r>
     </w:p>
     <w:p>
@@ -3082,7 +3094,19 @@
         <w:rPr>
           <w:lang w:val="es-419" w:eastAsia="es-CO"/>
         </w:rPr>
-        <w:t xml:space="preserve"> Representa aproximadamente el 80% de la composición total de las verduras, lo que contribuye a su baja densidad energética y a su papel hidratante en la alimentación.</w:t>
+        <w:t xml:space="preserve"> Representa aproximadamente el 80</w:t>
+      </w:r>
+      <w:r>
+        <w:rPr>
+          <w:lang w:val="es-419" w:eastAsia="es-CO"/>
+        </w:rPr>
+        <w:t xml:space="preserve"> </w:t>
+      </w:r>
+      <w:r>
+        <w:rPr>
+          <w:lang w:val="es-419" w:eastAsia="es-CO"/>
+        </w:rPr>
+        <w:t>% de la composición total de las verduras, lo que contribuye a su baja densidad energética y a su papel hidratante en la alimentación.</w:t>
       </w:r>
     </w:p>
     <w:p>
@@ -3158,7 +3182,31 @@
         <w:rPr>
           <w:lang w:val="es-419" w:eastAsia="es-CO"/>
         </w:rPr>
-        <w:t xml:space="preserve"> Se presenta en forma soluble e insoluble. La fibra soluble se encuentra principalmente en frutas y verduras, mientras que la insoluble predomina en cereales integrales y leguminosas. El contenido de fibra en las verduras oscila entre el 2% y el 10%.</w:t>
+        <w:t xml:space="preserve"> Se presenta en forma soluble e insoluble. La fibra soluble se encuentra principalmente en frutas y verduras, mientras que la insoluble predomina en cereales integrales y leguminosas. El contenido de fibra en las verduras oscila entre el 2</w:t>
+      </w:r>
+      <w:r>
+        <w:rPr>
+          <w:lang w:val="es-419" w:eastAsia="es-CO"/>
+        </w:rPr>
+        <w:t xml:space="preserve"> </w:t>
+      </w:r>
+      <w:r>
+        <w:rPr>
+          <w:lang w:val="es-419" w:eastAsia="es-CO"/>
+        </w:rPr>
+        <w:t>% y el 10</w:t>
+      </w:r>
+      <w:r>
+        <w:rPr>
+          <w:lang w:val="es-419" w:eastAsia="es-CO"/>
+        </w:rPr>
+        <w:t xml:space="preserve"> </w:t>
+      </w:r>
+      <w:r>
+        <w:rPr>
+          <w:lang w:val="es-419" w:eastAsia="es-CO"/>
+        </w:rPr>
+        <w:t>%.</w:t>
       </w:r>
     </w:p>
     <w:p>
@@ -3219,7 +3267,19 @@
         <w:rPr>
           <w:lang w:val="es-419" w:eastAsia="es-CO"/>
         </w:rPr>
-        <w:t>Contenido de carbohidratos: menor al 5%.</w:t>
+        <w:t>Contenido de carbohidratos: menor al 5</w:t>
+      </w:r>
+      <w:r>
+        <w:rPr>
+          <w:lang w:val="es-419" w:eastAsia="es-CO"/>
+        </w:rPr>
+        <w:t xml:space="preserve"> </w:t>
+      </w:r>
+      <w:r>
+        <w:rPr>
+          <w:lang w:val="es-419" w:eastAsia="es-CO"/>
+        </w:rPr>
+        <w:t>%.</w:t>
       </w:r>
     </w:p>
     <w:p>
@@ -3259,7 +3319,31 @@
         <w:rPr>
           <w:lang w:val="es-419" w:eastAsia="es-CO"/>
         </w:rPr>
-        <w:t>Contenido de carbohidratos: entre 5% y 10%.</w:t>
+        <w:t>Contenido de carbohidratos: entre 5</w:t>
+      </w:r>
+      <w:r>
+        <w:rPr>
+          <w:lang w:val="es-419" w:eastAsia="es-CO"/>
+        </w:rPr>
+        <w:t xml:space="preserve"> </w:t>
+      </w:r>
+      <w:r>
+        <w:rPr>
+          <w:lang w:val="es-419" w:eastAsia="es-CO"/>
+        </w:rPr>
+        <w:t>% y 10</w:t>
+      </w:r>
+      <w:r>
+        <w:rPr>
+          <w:lang w:val="es-419" w:eastAsia="es-CO"/>
+        </w:rPr>
+        <w:t xml:space="preserve"> </w:t>
+      </w:r>
+      <w:r>
+        <w:rPr>
+          <w:lang w:val="es-419" w:eastAsia="es-CO"/>
+        </w:rPr>
+        <w:t>%.</w:t>
       </w:r>
     </w:p>
     <w:p>
@@ -3299,7 +3383,19 @@
         <w:rPr>
           <w:lang w:val="es-419" w:eastAsia="es-CO"/>
         </w:rPr>
-        <w:t>Contenido de carbohidratos: aproximadamente 10%.</w:t>
+        <w:t>Contenido de carbohidratos: aproximadamente 10</w:t>
+      </w:r>
+      <w:r>
+        <w:rPr>
+          <w:lang w:val="es-419" w:eastAsia="es-CO"/>
+        </w:rPr>
+        <w:t xml:space="preserve"> </w:t>
+      </w:r>
+      <w:r>
+        <w:rPr>
+          <w:lang w:val="es-419" w:eastAsia="es-CO"/>
+        </w:rPr>
+        <w:t>%.</w:t>
       </w:r>
     </w:p>
     <w:p>
@@ -5020,15 +5116,27 @@
         </w:rPr>
         <w:tab/>
       </w:r>
+      <w:r>
+        <w:rPr>
+          <w:b/>
+        </w:rPr>
+        <w:t xml:space="preserve">Enlace de </w:t>
+      </w:r>
       <w:hyperlink r:id="rId13" w:history="1">
         <w:r>
           <w:rPr>
             <w:rStyle w:val="Hipervnculo"/>
             <w:b/>
           </w:rPr>
-          <w:t>Enlace de reproducción del video</w:t>
+          <w:t>reproducción</w:t>
         </w:r>
       </w:hyperlink>
+      <w:r>
+        <w:rPr>
+          <w:b/>
+        </w:rPr>
+        <w:t xml:space="preserve"> del video</w:t>
+      </w:r>
     </w:p>
     <w:tbl>
       <w:tblPr>
@@ -5070,24 +5178,29 @@
               </w:rPr>
               <w:t xml:space="preserve"> </w:t>
             </w:r>
-            <w:r>
+          </w:p>
+          <w:p>
+            <w:pPr>
+              <w:ind w:firstLine="0"/>
+              <w:jc w:val="center"/>
               <w:rPr>
                 <w:b/>
               </w:rPr>
-              <w:t>Video 1.</w:t>
-            </w:r>
+            </w:pPr>
             <w:r>
               <w:rPr>
                 <w:b/>
               </w:rPr>
-              <w:t xml:space="preserve"> </w:t>
-            </w:r>
+              <w:t xml:space="preserve">Eliminación del calor de campo en productos </w:t>
+            </w:r>
+            <w:proofErr w:type="spellStart"/>
             <w:r>
               <w:rPr>
                 <w:b/>
               </w:rPr>
-              <w:t>CIDM SENA FLORIDABLANCA</w:t>
-            </w:r>
+              <w:t>hortofructícolas</w:t>
+            </w:r>
+            <w:proofErr w:type="spellEnd"/>
           </w:p>
         </w:tc>
       </w:tr>
@@ -5103,12 +5216,12 @@
           </w:p>
           <w:p>
             <w:r>
+              <w:lastRenderedPageBreak/>
               <w:t>El calor de campo es uno de los principales factores que reduce la vida útil de frutas y verduras. Si no se controla a tiempo, se pierde frescura, textura y valor nutricional, afectando la calidad que recibe el consumidor.</w:t>
             </w:r>
           </w:p>
           <w:p>
             <w:r>
-              <w:lastRenderedPageBreak/>
               <w:t xml:space="preserve">Por eso, eliminar el calor de campo es una etapa clave en la </w:t>
             </w:r>
             <w:proofErr w:type="spellStart"/>
@@ -5203,6 +5316,7 @@
         <w:rPr>
           <w:rStyle w:val="Ttulo5Car"/>
         </w:rPr>
+        <w:lastRenderedPageBreak/>
         <w:t>Crecimiento microbiano.</w:t>
       </w:r>
       <w:r>
@@ -5217,7 +5331,6 @@
         <w:pStyle w:val="Ttulo3"/>
       </w:pPr>
       <w:r>
-        <w:lastRenderedPageBreak/>
         <w:t>Tipos de preenfriamiento</w:t>
       </w:r>
     </w:p>
@@ -5441,8 +5554,14 @@
                 <w:b/>
                 <w:bCs/>
               </w:rPr>
-              <w:lastRenderedPageBreak/>
               <w:t xml:space="preserve">Transcripción pódcast. </w:t>
+            </w:r>
+            <w:r>
+              <w:rPr>
+                <w:b/>
+                <w:bCs/>
+              </w:rPr>
+              <w:t>Control de la maduración</w:t>
             </w:r>
           </w:p>
         </w:tc>
@@ -5574,12 +5693,12 @@
                 <w:b/>
                 <w:bCs/>
               </w:rPr>
+              <w:lastRenderedPageBreak/>
               <w:t>DON CAMPOS</w:t>
             </w:r>
           </w:p>
           <w:p>
             <w:r>
-              <w:lastRenderedPageBreak/>
               <w:t>Por eso, cuando una fruta madura, puede acelerar la maduración de las otras que están cerca. Es como un efecto contagioso.</w:t>
             </w:r>
           </w:p>
@@ -5700,6 +5819,7 @@
           </w:p>
           <w:p>
             <w:r>
+              <w:lastRenderedPageBreak/>
               <w:t>Porque entender la maduración no es pelear con la naturaleza, es aprender a trabajar con ella.</w:t>
             </w:r>
           </w:p>
@@ -5715,7 +5835,6 @@
                 <w:b/>
                 <w:bCs/>
               </w:rPr>
-              <w:lastRenderedPageBreak/>
               <w:t>ASUSENA</w:t>
             </w:r>
           </w:p>
@@ -6260,6 +6379,7 @@
                 <w:color w:val="12263F"/>
                 <w:szCs w:val="24"/>
               </w:rPr>
+              <w:lastRenderedPageBreak/>
               <w:t>Tomate</w:t>
             </w:r>
           </w:p>
@@ -6427,7 +6547,6 @@
         <w:pStyle w:val="Ttulo3"/>
       </w:pPr>
       <w:r>
-        <w:lastRenderedPageBreak/>
         <w:t>Fuentes de adquisición de etileno para el control de la maduración</w:t>
       </w:r>
     </w:p>
@@ -6485,6 +6604,8 @@
       <w:proofErr w:type="spellStart"/>
       <w:r>
         <w:rPr>
+          <w:i/>
+          <w:iCs/>
           <w:lang w:val="es-419" w:eastAsia="es-CO"/>
         </w:rPr>
         <w:t>ethrel</w:t>
@@ -6499,6 +6620,8 @@
       <w:proofErr w:type="spellStart"/>
       <w:r>
         <w:rPr>
+          <w:i/>
+          <w:iCs/>
           <w:lang w:val="es-419" w:eastAsia="es-CO"/>
         </w:rPr>
         <w:t>ethephon</w:t>
@@ -6513,9 +6636,17 @@
       <w:proofErr w:type="spellStart"/>
       <w:r>
         <w:rPr>
-          <w:lang w:val="es-419" w:eastAsia="es-CO"/>
-        </w:rPr>
-        <w:t>ethrel</w:t>
+          <w:i/>
+          <w:iCs/>
+          <w:lang w:val="es-419" w:eastAsia="es-CO"/>
+        </w:rPr>
+        <w:t>ethre</w:t>
+      </w:r>
+      <w:r>
+        <w:rPr>
+          <w:lang w:val="es-419" w:eastAsia="es-CO"/>
+        </w:rPr>
+        <w:t>l</w:t>
       </w:r>
       <w:proofErr w:type="spellEnd"/>
       <w:r>
@@ -6607,20 +6738,6 @@
         </w:rPr>
         <w:t>Se desarrolla en presencia de oxígeno y corresponde a la forma normal de respiración de los tejidos vegetales.</w:t>
       </w:r>
-    </w:p>
-    <w:p>
-      <w:pPr>
-        <w:rPr>
-          <w:lang w:val="es-419" w:eastAsia="es-CO"/>
-        </w:rPr>
-      </w:pPr>
-    </w:p>
-    <w:p>
-      <w:pPr>
-        <w:rPr>
-          <w:lang w:val="es-419" w:eastAsia="es-CO"/>
-        </w:rPr>
-      </w:pPr>
     </w:p>
     <w:p>
       <w:pPr>
@@ -6699,9 +6816,6 @@
     </w:p>
     <w:p>
       <w:pPr>
-        <w:tabs>
-          <w:tab w:val="left" w:pos="2040"/>
-        </w:tabs>
         <w:rPr>
           <w:lang w:val="es-419" w:eastAsia="es-CO"/>
         </w:rPr>
@@ -6735,9 +6849,6 @@
     </w:p>
     <w:p>
       <w:pPr>
-        <w:tabs>
-          <w:tab w:val="left" w:pos="2040"/>
-        </w:tabs>
         <w:rPr>
           <w:lang w:val="es-419" w:eastAsia="es-CO"/>
         </w:rPr>
@@ -7749,9 +7860,6 @@
           <w:p>
             <w:pPr>
               <w:pStyle w:val="TextoTablas"/>
-              <w:rPr>
-                <w:rStyle w:val="Hipervnculo"/>
-              </w:rPr>
             </w:pPr>
             <w:hyperlink r:id="rId17" w:history="1">
               <w:r>
@@ -13640,30 +13748,10 @@
 </file>
 
 <file path=customXml/item1.xml><?xml version="1.0" encoding="utf-8"?>
-<p:properties xmlns:p="http://schemas.microsoft.com/office/2006/metadata/properties" xmlns:xsi="http://www.w3.org/2001/XMLSchema-instance" xmlns:pc="http://schemas.microsoft.com/office/infopath/2007/PartnerControls">
-  <documentManagement>
-    <TaxCatchAll xmlns="b250f519-6473-4480-8c44-6ee3a3a530c3" xsi:nil="true"/>
-    <lcf76f155ced4ddcb4097134ff3c332f xmlns="d174a4fb-80c2-4523-8d89-375030acacbf">
-      <Terms xmlns="http://schemas.microsoft.com/office/infopath/2007/PartnerControls"/>
-    </lcf76f155ced4ddcb4097134ff3c332f>
-  </documentManagement>
-</p:properties>
+<b:Sources xmlns:b="http://schemas.openxmlformats.org/officeDocument/2006/bibliography" xmlns="http://schemas.openxmlformats.org/officeDocument/2006/bibliography" SelectedStyle="\APASixthEditionOfficeOnline.xsl" StyleName="APA" Version="6"/>
 </file>
 
 <file path=customXml/item2.xml><?xml version="1.0" encoding="utf-8"?>
-<?mso-contentType ?>
-<FormTemplates xmlns="http://schemas.microsoft.com/sharepoint/v3/contenttype/forms">
-  <Display>DocumentLibraryForm</Display>
-  <Edit>DocumentLibraryForm</Edit>
-  <New>DocumentLibraryForm</New>
-</FormTemplates>
-</file>
-
-<file path=customXml/item3.xml><?xml version="1.0" encoding="utf-8"?>
-<b:Sources xmlns:b="http://schemas.openxmlformats.org/officeDocument/2006/bibliography" xmlns="http://schemas.openxmlformats.org/officeDocument/2006/bibliography" SelectedStyle="\APASixthEditionOfficeOnline.xsl" StyleName="APA" Version="6"/>
-</file>
-
-<file path=customXml/item4.xml><?xml version="1.0" encoding="utf-8"?>
 <ct:contentTypeSchema xmlns:ct="http://schemas.microsoft.com/office/2006/metadata/contentType" xmlns:ma="http://schemas.microsoft.com/office/2006/metadata/properties/metaAttributes" ct:_="" ma:_="" ma:contentTypeName="Documento" ma:contentTypeID="0x010100EA8A463C70CDF94EBCEAEE24D04F3F8A" ma:contentTypeVersion="12" ma:contentTypeDescription="Crear nuevo documento." ma:contentTypeScope="" ma:versionID="0a68c197ff11ee8f2a4dfa92d3e5c792">
   <xsd:schema xmlns:xsd="http://www.w3.org/2001/XMLSchema" xmlns:xs="http://www.w3.org/2001/XMLSchema" xmlns:p="http://schemas.microsoft.com/office/2006/metadata/properties" xmlns:ns2="d174a4fb-80c2-4523-8d89-375030acacbf" xmlns:ns3="b250f519-6473-4480-8c44-6ee3a3a530c3" targetNamespace="http://schemas.microsoft.com/office/2006/metadata/properties" ma:root="true" ma:fieldsID="55936f832c432473a7bcdfeafd102760" ns2:_="" ns3:_="">
     <xsd:import namespace="d174a4fb-80c2-4523-8d89-375030acacbf"/>
@@ -13864,26 +13952,27 @@
 </ct:contentTypeSchema>
 </file>
 
-<file path=customXml/itemProps1.xml><?xml version="1.0" encoding="utf-8"?>
-<ds:datastoreItem xmlns:ds="http://schemas.openxmlformats.org/officeDocument/2006/customXml" ds:itemID="{1279454D-02BE-4A9C-A117-DCD1573E2608}">
-  <ds:schemaRefs>
-    <ds:schemaRef ds:uri="http://schemas.microsoft.com/office/2006/metadata/properties"/>
-    <ds:schemaRef ds:uri="http://schemas.microsoft.com/office/infopath/2007/PartnerControls"/>
-    <ds:schemaRef ds:uri="b250f519-6473-4480-8c44-6ee3a3a530c3"/>
-    <ds:schemaRef ds:uri="d174a4fb-80c2-4523-8d89-375030acacbf"/>
-  </ds:schemaRefs>
-</ds:datastoreItem>
+<file path=customXml/item3.xml><?xml version="1.0" encoding="utf-8"?>
+<p:properties xmlns:p="http://schemas.microsoft.com/office/2006/metadata/properties" xmlns:xsi="http://www.w3.org/2001/XMLSchema-instance" xmlns:pc="http://schemas.microsoft.com/office/infopath/2007/PartnerControls">
+  <documentManagement>
+    <TaxCatchAll xmlns="b250f519-6473-4480-8c44-6ee3a3a530c3" xsi:nil="true"/>
+    <lcf76f155ced4ddcb4097134ff3c332f xmlns="d174a4fb-80c2-4523-8d89-375030acacbf">
+      <Terms xmlns="http://schemas.microsoft.com/office/infopath/2007/PartnerControls"/>
+    </lcf76f155ced4ddcb4097134ff3c332f>
+  </documentManagement>
+</p:properties>
 </file>
 
-<file path=customXml/itemProps2.xml><?xml version="1.0" encoding="utf-8"?>
-<ds:datastoreItem xmlns:ds="http://schemas.openxmlformats.org/officeDocument/2006/customXml" ds:itemID="{10663269-2064-4804-8290-36D4A57F5557}">
-  <ds:schemaRefs>
-    <ds:schemaRef ds:uri="http://schemas.microsoft.com/sharepoint/v3/contenttype/forms"/>
-  </ds:schemaRefs>
-</ds:datastoreItem>
+<file path=customXml/item4.xml><?xml version="1.0" encoding="utf-8"?>
+<?mso-contentType ?>
+<FormTemplates xmlns="http://schemas.microsoft.com/sharepoint/v3/contenttype/forms">
+  <Display>DocumentLibraryForm</Display>
+  <Edit>DocumentLibraryForm</Edit>
+  <New>DocumentLibraryForm</New>
+</FormTemplates>
 </file>
 
-<file path=customXml/itemProps3.xml><?xml version="1.0" encoding="utf-8"?>
+<file path=customXml/itemProps1.xml><?xml version="1.0" encoding="utf-8"?>
 <ds:datastoreItem xmlns:ds="http://schemas.openxmlformats.org/officeDocument/2006/customXml" ds:itemID="{EAE431FD-7059-4C09-804B-C9D69EB7B213}">
   <ds:schemaRefs>
     <ds:schemaRef ds:uri="http://schemas.openxmlformats.org/officeDocument/2006/bibliography"/>
@@ -13891,7 +13980,7 @@
 </ds:datastoreItem>
 </file>
 
-<file path=customXml/itemProps4.xml><?xml version="1.0" encoding="utf-8"?>
+<file path=customXml/itemProps2.xml><?xml version="1.0" encoding="utf-8"?>
 <ds:datastoreItem xmlns:ds="http://schemas.openxmlformats.org/officeDocument/2006/customXml" ds:itemID="{A4437E4D-C5C8-4CAE-BD38-A55A98DE3B0D}">
   <ds:schemaRefs>
     <ds:schemaRef ds:uri="http://schemas.microsoft.com/office/2006/metadata/contentType"/>
@@ -13908,4 +13997,23 @@
     <ds:schemaRef ds:uri="http://schemas.microsoft.com/internal/obd"/>
   </ds:schemaRefs>
 </ds:datastoreItem>
+</file>
+
+<file path=customXml/itemProps3.xml><?xml version="1.0" encoding="utf-8"?>
+<ds:datastoreItem xmlns:ds="http://schemas.openxmlformats.org/officeDocument/2006/customXml" ds:itemID="{1279454D-02BE-4A9C-A117-DCD1573E2608}">
+  <ds:schemaRefs>
+    <ds:schemaRef ds:uri="http://schemas.microsoft.com/office/2006/metadata/properties"/>
+    <ds:schemaRef ds:uri="http://schemas.microsoft.com/office/infopath/2007/PartnerControls"/>
+    <ds:schemaRef ds:uri="b250f519-6473-4480-8c44-6ee3a3a530c3"/>
+    <ds:schemaRef ds:uri="d174a4fb-80c2-4523-8d89-375030acacbf"/>
+  </ds:schemaRefs>
+</ds:datastoreItem>
+</file>
+
+<file path=customXml/itemProps4.xml><?xml version="1.0" encoding="utf-8"?>
+<ds:datastoreItem xmlns:ds="http://schemas.openxmlformats.org/officeDocument/2006/customXml" ds:itemID="{10663269-2064-4804-8290-36D4A57F5557}">
+  <ds:schemaRefs>
+    <ds:schemaRef ds:uri="http://schemas.microsoft.com/sharepoint/v3/contenttype/forms"/>
+  </ds:schemaRefs>
+</ds:datastoreItem>
 </file>
</xml_diff>